<commit_message>
Updated the proper GitHub link for the evidence
</commit_message>
<xml_diff>
--- a/Evidence/[Validation] PWA service worker when the start page is reached through a redirect.docx
+++ b/Evidence/[Validation] PWA service worker when the start page is reached through a redirect.docx
@@ -248,10 +248,10 @@
         <w:tblLook w:val="04A0" w:firstRow="1" w:lastRow="0" w:firstColumn="1" w:lastColumn="0" w:noHBand="0" w:noVBand="1"/>
       </w:tblPr>
       <w:tblGrid>
-        <w:gridCol w:w="742"/>
-        <w:gridCol w:w="3595"/>
-        <w:gridCol w:w="917"/>
-        <w:gridCol w:w="4096"/>
+        <w:gridCol w:w="715"/>
+        <w:gridCol w:w="3421"/>
+        <w:gridCol w:w="881"/>
+        <w:gridCol w:w="4333"/>
       </w:tblGrid>
       <w:tr>
         <w:tc>
@@ -451,6 +451,7 @@
           </w:tcPr>
           <w:p>
             <w:r>
+              <w:lastRenderedPageBreak/>
               <w:t>2</w:t>
             </w:r>
           </w:p>
@@ -472,7 +473,6 @@
           </w:tcPr>
           <w:p>
             <w:r>
-              <w:lastRenderedPageBreak/>
               <w:t>pass</w:t>
             </w:r>
           </w:p>
@@ -509,14 +509,7 @@
                 <w:rPr>
                   <w:rStyle w:val="Hyperlink"/>
                 </w:rPr>
-                <w:t xml:space="preserve">-redirect-validation/Evidence/Online reload serves.png at main · </w:t>
-              </w:r>
-              <w:r>
-                <w:rPr>
-                  <w:rStyle w:val="Hyperlink"/>
-                </w:rPr>
-                <w:lastRenderedPageBreak/>
-                <w:t>karmegams02/</w:t>
+                <w:t>-redirect-validation/Evidence/Online reload serves.png at main · karmegams02/</w:t>
               </w:r>
               <w:proofErr w:type="spellStart"/>
               <w:r>
@@ -557,7 +550,6 @@
           </w:tcPr>
           <w:p>
             <w:r>
-              <w:lastRenderedPageBreak/>
               <w:t>3</w:t>
             </w:r>
           </w:p>
@@ -1163,7 +1155,11 @@
           </w:tcPr>
           <w:p>
             <w:r>
-              <w:t>No differences are expected between browsers. If one browser serves the app and another shows an error page, that is a finding.</w:t>
+              <w:t xml:space="preserve">No differences are expected between browsers. If one </w:t>
+            </w:r>
+            <w:r>
+              <w:lastRenderedPageBreak/>
+              <w:t>browser serves the app and another shows an error page, that is a finding.</w:t>
             </w:r>
           </w:p>
           <w:p/>
@@ -1174,6 +1170,7 @@
           </w:tcPr>
           <w:p>
             <w:r>
+              <w:lastRenderedPageBreak/>
               <w:t>pass</w:t>
             </w:r>
           </w:p>
@@ -1184,24 +1181,38 @@
           </w:tcPr>
           <w:p>
             <w:hyperlink r:id="rId24" w:history="1">
-              <w:r>
-                <w:rPr>
-                  <w:rStyle w:val="Hyperlink"/>
-                </w:rPr>
-                <w:t>EdgeBrowserTest.png</w:t>
-              </w:r>
+              <w:proofErr w:type="spellStart"/>
+              <w:r>
+                <w:rPr>
+                  <w:rStyle w:val="Hyperlink"/>
+                </w:rPr>
+                <w:t>EdgeBrowserTest</w:t>
+              </w:r>
+              <w:proofErr w:type="spellEnd"/>
             </w:hyperlink>
             <w:r>
-              <w:t xml:space="preserve"> and </w:t>
-            </w:r>
-            <w:hyperlink r:id="rId25" w:history="1">
-              <w:r>
-                <w:rPr>
-                  <w:rStyle w:val="Hyperlink"/>
-                </w:rPr>
-                <w:t>ChromeBrowserTest.png</w:t>
-              </w:r>
-            </w:hyperlink>
+              <w:t> and </w:t>
+            </w:r>
+            <w:proofErr w:type="spellStart"/>
+            <w:r>
+              <w:fldChar w:fldCharType="begin"/>
+            </w:r>
+            <w:r>
+              <w:instrText>HYPERLINK "https://github.com/karmegams02/blazor-pwa-redirect-validation/blob/main/Evidence/ChromeBrowserTest.mp4"</w:instrText>
+            </w:r>
+            <w:r>
+              <w:fldChar w:fldCharType="separate"/>
+            </w:r>
+            <w:r>
+              <w:rPr>
+                <w:rStyle w:val="Hyperlink"/>
+              </w:rPr>
+              <w:t>ChromeBrowserTest</w:t>
+            </w:r>
+            <w:proofErr w:type="spellEnd"/>
+            <w:r>
+              <w:fldChar w:fldCharType="end"/>
+            </w:r>
           </w:p>
         </w:tc>
       </w:tr>
@@ -1209,150 +1220,92 @@
     <w:p/>
     <w:p/>
     <w:p>
+      <w:pPr>
+        <w:rPr>
+          <w:b/>
+          <w:bCs/>
+        </w:rPr>
+      </w:pPr>
       <w:r>
         <w:rPr>
           <w:b/>
           <w:bCs/>
         </w:rPr>
-        <w:t>NET 10</w:t>
+        <w:t>Supporting Evidence</w:t>
       </w:r>
-      <w:r>
-        <w:t xml:space="preserve"> </w:t>
-      </w:r>
-      <w:hyperlink r:id="rId26" w:history="1">
-        <w:r>
-          <w:rPr>
-            <w:b/>
-            <w:bCs/>
-          </w:rPr>
-          <w:t>Issue replication demo:</w:t>
-        </w:r>
-        <w:r>
-          <w:t xml:space="preserve"> </w:t>
-        </w:r>
-        <w:proofErr w:type="spellStart"/>
-        <w:r>
-          <w:rPr>
-            <w:rStyle w:val="Hyperlink"/>
-          </w:rPr>
-          <w:t>blazor</w:t>
-        </w:r>
-        <w:proofErr w:type="spellEnd"/>
-        <w:r>
-          <w:rPr>
-            <w:rStyle w:val="Hyperlink"/>
-          </w:rPr>
-          <w:t>-</w:t>
-        </w:r>
-        <w:proofErr w:type="spellStart"/>
-        <w:r>
-          <w:rPr>
-            <w:rStyle w:val="Hyperlink"/>
-          </w:rPr>
-          <w:t>pwa</w:t>
-        </w:r>
-        <w:proofErr w:type="spellEnd"/>
-        <w:r>
-          <w:rPr>
-            <w:rStyle w:val="Hyperlink"/>
-          </w:rPr>
-          <w:t>-redirect-validation/Evidence/NET 10 Issue replication.zip at main · karmegams02/</w:t>
-        </w:r>
-        <w:proofErr w:type="spellStart"/>
-        <w:r>
-          <w:rPr>
-            <w:rStyle w:val="Hyperlink"/>
-          </w:rPr>
-          <w:t>blazor</w:t>
-        </w:r>
-        <w:proofErr w:type="spellEnd"/>
-        <w:r>
-          <w:rPr>
-            <w:rStyle w:val="Hyperlink"/>
-          </w:rPr>
-          <w:t>-</w:t>
-        </w:r>
-        <w:proofErr w:type="spellStart"/>
-        <w:r>
-          <w:rPr>
-            <w:rStyle w:val="Hyperlink"/>
-          </w:rPr>
-          <w:t>pwa</w:t>
-        </w:r>
-        <w:proofErr w:type="spellEnd"/>
-        <w:r>
-          <w:rPr>
-            <w:rStyle w:val="Hyperlink"/>
-          </w:rPr>
-          <w:t>-redirect-validation · GitHub</w:t>
-        </w:r>
-      </w:hyperlink>
     </w:p>
-    <w:p/>
     <w:p>
+      <w:pPr>
+        <w:rPr>
+          <w:b/>
+          <w:bCs/>
+        </w:rPr>
+      </w:pPr>
       <w:r>
         <w:rPr>
           <w:b/>
           <w:bCs/>
         </w:rPr>
-        <w:t xml:space="preserve">NET 11 testing ensured: </w:t>
+        <w:t xml:space="preserve">.NET 10 Issue Reproduction </w:t>
       </w:r>
-      <w:hyperlink r:id="rId27" w:history="1">
-        <w:proofErr w:type="spellStart"/>
+      <w:proofErr w:type="gramStart"/>
+      <w:r>
+        <w:rPr>
+          <w:b/>
+          <w:bCs/>
+        </w:rPr>
+        <w:t>Video :</w:t>
+      </w:r>
+      <w:proofErr w:type="gramEnd"/>
+      <w:r>
+        <w:rPr>
+          <w:b/>
+          <w:bCs/>
+        </w:rPr>
+        <w:t> </w:t>
+      </w:r>
+      <w:hyperlink r:id="rId25" w:history="1">
         <w:r>
           <w:rPr>
             <w:rStyle w:val="Hyperlink"/>
+            <w:b/>
+            <w:bCs/>
           </w:rPr>
-          <w:t>blazor</w:t>
+          <w:t>NET 10 Issue replication</w:t>
         </w:r>
-        <w:proofErr w:type="spellEnd"/>
+      </w:hyperlink>
+      <w:r>
+        <w:rPr>
+          <w:b/>
+          <w:bCs/>
+        </w:rPr>
+        <w:br/>
+        <w:t xml:space="preserve">.NET 11 Validation </w:t>
+      </w:r>
+      <w:proofErr w:type="gramStart"/>
+      <w:r>
+        <w:rPr>
+          <w:b/>
+          <w:bCs/>
+        </w:rPr>
+        <w:t>Video :</w:t>
+      </w:r>
+      <w:proofErr w:type="gramEnd"/>
+      <w:r>
+        <w:rPr>
+          <w:b/>
+          <w:bCs/>
+        </w:rPr>
+        <w:t> </w:t>
+      </w:r>
+      <w:hyperlink r:id="rId26" w:history="1">
         <w:r>
           <w:rPr>
             <w:rStyle w:val="Hyperlink"/>
+            <w:b/>
+            <w:bCs/>
           </w:rPr>
-          <w:t>-</w:t>
-        </w:r>
-        <w:proofErr w:type="spellStart"/>
-        <w:r>
-          <w:rPr>
-            <w:rStyle w:val="Hyperlink"/>
-          </w:rPr>
-          <w:t>pwa</w:t>
-        </w:r>
-        <w:proofErr w:type="spellEnd"/>
-        <w:r>
-          <w:rPr>
-            <w:rStyle w:val="Hyperlink"/>
-          </w:rPr>
-          <w:t>-redirect-validation/Evidence/NET 11 PWA Service worker test.zip at main · karmegams02/</w:t>
-        </w:r>
-        <w:proofErr w:type="spellStart"/>
-        <w:r>
-          <w:rPr>
-            <w:rStyle w:val="Hyperlink"/>
-          </w:rPr>
-          <w:t>blazor</w:t>
-        </w:r>
-        <w:proofErr w:type="spellEnd"/>
-        <w:r>
-          <w:rPr>
-            <w:rStyle w:val="Hyperlink"/>
-          </w:rPr>
-          <w:t>-</w:t>
-        </w:r>
-        <w:proofErr w:type="spellStart"/>
-        <w:r>
-          <w:rPr>
-            <w:rStyle w:val="Hyperlink"/>
-          </w:rPr>
-          <w:t>pwa</w:t>
-        </w:r>
-        <w:proofErr w:type="spellEnd"/>
-        <w:r>
-          <w:rPr>
-            <w:rStyle w:val="Hyperlink"/>
-          </w:rPr>
-          <w:t>-redirect-validation · GitHub</w:t>
+          <w:t>NET 11 PWA Service worker test</w:t>
         </w:r>
       </w:hyperlink>
     </w:p>
@@ -4037,6 +3990,15 @@
 </file>
 
 <file path=customXml/item2.xml><?xml version="1.0" encoding="utf-8"?>
+<?mso-contentType ?>
+<FormTemplates xmlns="http://schemas.microsoft.com/sharepoint/v3/contenttype/forms">
+  <Display>DocumentLibraryForm</Display>
+  <Edit>DocumentLibraryForm</Edit>
+  <New>DocumentLibraryForm</New>
+</FormTemplates>
+</file>
+
+<file path=customXml/item3.xml><?xml version="1.0" encoding="utf-8"?>
 <ct:contentTypeSchema xmlns:ct="http://schemas.microsoft.com/office/2006/metadata/contentType" xmlns:ma="http://schemas.microsoft.com/office/2006/metadata/properties/metaAttributes" ct:_="" ma:_="" ma:contentTypeName="Document" ma:contentTypeID="0x0101002A361625FF487C4CA3EA5191E57B8C6D" ma:contentTypeVersion="10" ma:contentTypeDescription="Create a new document." ma:contentTypeScope="" ma:versionID="460a0a69af9734aeff2026eb69990c75">
   <xsd:schema xmlns:xsd="http://www.w3.org/2001/XMLSchema" xmlns:xs="http://www.w3.org/2001/XMLSchema" xmlns:p="http://schemas.microsoft.com/office/2006/metadata/properties" xmlns:ns2="caee7eb6-6dd4-45c1-9e8a-babddf390f35" xmlns:ns3="76301635-9239-4c63-b7c3-1485db98b457" targetNamespace="http://schemas.microsoft.com/office/2006/metadata/properties" ma:root="true" ma:fieldsID="df81253d5c86e2f07a84be4452311541" ns2:_="" ns3:_="">
     <xsd:import namespace="caee7eb6-6dd4-45c1-9e8a-babddf390f35"/>
@@ -4223,15 +4185,6 @@
 </ct:contentTypeSchema>
 </file>
 
-<file path=customXml/item3.xml><?xml version="1.0" encoding="utf-8"?>
-<?mso-contentType ?>
-<FormTemplates xmlns="http://schemas.microsoft.com/sharepoint/v3/contenttype/forms">
-  <Display>DocumentLibraryForm</Display>
-  <Edit>DocumentLibraryForm</Edit>
-  <New>DocumentLibraryForm</New>
-</FormTemplates>
-</file>
-
 <file path=customXml/itemProps1.xml><?xml version="1.0" encoding="utf-8"?>
 <ds:datastoreItem xmlns:ds="http://schemas.openxmlformats.org/officeDocument/2006/customXml" ds:itemID="{F5914588-E53C-4630-AC3C-554394DD0297}">
   <ds:schemaRefs>
@@ -4244,6 +4197,14 @@
 </file>
 
 <file path=customXml/itemProps2.xml><?xml version="1.0" encoding="utf-8"?>
+<ds:datastoreItem xmlns:ds="http://schemas.openxmlformats.org/officeDocument/2006/customXml" ds:itemID="{A5A7F1FD-CE26-4C6E-80B9-F7C0DA317E9C}">
+  <ds:schemaRefs>
+    <ds:schemaRef ds:uri="http://schemas.microsoft.com/sharepoint/v3/contenttype/forms"/>
+  </ds:schemaRefs>
+</ds:datastoreItem>
+</file>
+
+<file path=customXml/itemProps3.xml><?xml version="1.0" encoding="utf-8"?>
 <ds:datastoreItem xmlns:ds="http://schemas.openxmlformats.org/officeDocument/2006/customXml" ds:itemID="{CA84680B-EADD-4150-AEDF-CAA5335595FA}">
   <ds:schemaRefs>
     <ds:schemaRef ds:uri="http://schemas.microsoft.com/office/2006/metadata/contentType"/>
@@ -4260,12 +4221,4 @@
     <ds:schemaRef ds:uri="http://schemas.microsoft.com/internal/obd"/>
   </ds:schemaRefs>
 </ds:datastoreItem>
-</file>
-
-<file path=customXml/itemProps3.xml><?xml version="1.0" encoding="utf-8"?>
-<ds:datastoreItem xmlns:ds="http://schemas.openxmlformats.org/officeDocument/2006/customXml" ds:itemID="{A5A7F1FD-CE26-4C6E-80B9-F7C0DA317E9C}">
-  <ds:schemaRefs>
-    <ds:schemaRef ds:uri="http://schemas.microsoft.com/sharepoint/v3/contenttype/forms"/>
-  </ds:schemaRefs>
-</ds:datastoreItem>
 </file>
</xml_diff>